<commit_message>
Update: add content to monthly.docx
</commit_message>
<xml_diff>
--- a/docs/final/internal_data/monthly.docx
+++ b/docs/final/internal_data/monthly.docx
@@ -17,6 +17,85 @@
       </w:r>
     </w:p>
     <w:p/>
+    <w:p>
+      <w:pPr>
+        <w:jc w:val="left"/>
+      </w:pPr>
+      <w:r>
+        <w:rPr>
+          <w:rFonts w:ascii="黑体" w:hAnsi="黑体" w:eastAsia="黑体"/>
+          <w:b/>
+          <w:color w:val="000000"/>
+          <w:sz w:val="24"/>
+        </w:rPr>
+        <w:t>月频汇总</w:t>
+      </w:r>
+    </w:p>
+    <w:p>
+      <w:pPr>
+        <w:jc w:val="center"/>
+      </w:pPr>
+      <w:r>
+        <w:drawing>
+          <wp:inline xmlns:a="http://schemas.openxmlformats.org/drawingml/2006/main" xmlns:pic="http://schemas.openxmlformats.org/drawingml/2006/picture">
+            <wp:extent cx="5029200" cy="3562652"/>
+            <wp:docPr id="1" name="Picture 1"/>
+            <wp:cNvGraphicFramePr>
+              <a:graphicFrameLocks noChangeAspect="1"/>
+            </wp:cNvGraphicFramePr>
+            <a:graphic>
+              <a:graphicData uri="http://schemas.openxmlformats.org/drawingml/2006/picture">
+                <pic:pic>
+                  <pic:nvPicPr>
+                    <pic:cNvPr id="0" name="monthly_dashboard.png"/>
+                    <pic:cNvPicPr/>
+                  </pic:nvPicPr>
+                  <pic:blipFill>
+                    <a:blip r:embed="rId9"/>
+                    <a:stretch>
+                      <a:fillRect/>
+                    </a:stretch>
+                  </pic:blipFill>
+                  <pic:spPr>
+                    <a:xfrm>
+                      <a:off x="0" y="0"/>
+                      <a:ext cx="5029200" cy="3562652"/>
+                    </a:xfrm>
+                    <a:prstGeom prst="rect"/>
+                  </pic:spPr>
+                </pic:pic>
+              </a:graphicData>
+            </a:graphic>
+          </wp:inline>
+        </w:drawing>
+      </w:r>
+    </w:p>
+    <w:p>
+      <w:pPr>
+        <w:jc w:val="left"/>
+      </w:pPr>
+      <w:r>
+        <w:rPr>
+          <w:rFonts w:ascii="宋体" w:hAnsi="宋体" w:eastAsia="宋体"/>
+          <w:color w:val="000000"/>
+          <w:sz w:val="22"/>
+        </w:rPr>
+        <w:t>都市题材占据绝对主导，播放量占比69.3%（97.6万），收益占比69.1%（1649元）；玄幻题材播放量占比28.5%，万播收益最高（17.7元/万播）。</w:t>
+      </w:r>
+    </w:p>
+    <w:p>
+      <w:pPr>
+        <w:jc w:val="left"/>
+      </w:pPr>
+      <w:r>
+        <w:rPr>
+          <w:rFonts w:ascii="宋体" w:hAnsi="宋体" w:eastAsia="宋体"/>
+          <w:color w:val="000000"/>
+          <w:sz w:val="22"/>
+        </w:rPr>
+        <w:t>频道方面，女频贡献69.2%播放量（98.7万）和69.3%收益（1651元），男女频万播收益接近（均为16.7元），变现效率相当。</w:t>
+      </w:r>
+    </w:p>
     <w:sectPr>
       <w:pgSz w:w="12240" w:h="15840"/>
       <w:pgMar w:top="1440" w:right="1800" w:bottom="1440" w:left="1800" w:header="720" w:footer="720" w:gutter="0"/>

</xml_diff>